<commit_message>
Fiche : en-tete sur lignes distinctes + 'Organisme d'accueil'
L'en-tete de la fiche etait sur une seule ligne (champs colles). Chaque champ
est desormais sur sa propre ligne : Matricule, Nom & Prenom, Filiere, Organisme
d'accueil (libelle renomme depuis 'Entreprise d'accueil'), Date de soutenance.
Memes jetons -> aucun changement de code de remplissage.

Co-Authored-By: Claude Opus 4.8 <noreply@anthropic.com>
</commit_message>
<xml_diff>
--- a/soutenances/assets/fiche_evaluation_template.docx
+++ b/soutenances/assets/fiche_evaluation_template.docx
@@ -467,103 +467,51 @@
     <w:p>
       <w:pPr>
         <w:pStyle w:val="Corpsdetexte"/>
-        <w:spacing w:before="113"/>
-        <w:ind w:left="1401" w:right="170"/>
-        <w:jc w:val="both"/>
-      </w:pPr>
-      <w:r>
-        <w:t>Matricule</w:t>
-      </w:r>
-      <w:r>
-        <w:rPr>
-          <w:spacing w:val="-15"/>
-        </w:rPr>
-        <w:t xml:space="preserve"> </w:t>
-      </w:r>
-      <w:r>
-        <w:t>:</w:t>
-      </w:r>
-      <w:r>
-        <w:rPr>
-          <w:spacing w:val="-15"/>
-        </w:rPr>
-        <w:t xml:space="preserve"> </w:t>
-      </w:r>
-      <w:r>
-        <w:t xml:space="preserve">{{MATRICULE}} Nom</w:t>
-      </w:r>
-      <w:r>
-        <w:rPr>
-          <w:spacing w:val="-8"/>
-        </w:rPr>
-        <w:t xml:space="preserve"> </w:t>
-      </w:r>
-      <w:r>
-        <w:t>&amp;</w:t>
-      </w:r>
-      <w:r>
-        <w:rPr>
-          <w:spacing w:val="-10"/>
-        </w:rPr>
-        <w:t xml:space="preserve"> </w:t>
-      </w:r>
-      <w:r>
-        <w:t>Prénom</w:t>
-      </w:r>
-      <w:r>
-        <w:rPr>
-          <w:spacing w:val="-6"/>
-        </w:rPr>
-        <w:t xml:space="preserve"> </w:t>
-      </w:r>
-      <w:r>
-        <w:rPr>
-          <w:sz w:val="20"/>
-        </w:rPr>
-        <w:t>(de</w:t>
-      </w:r>
-      <w:r>
-        <w:rPr>
-          <w:spacing w:val="-5"/>
-          <w:sz w:val="20"/>
-        </w:rPr>
-        <w:t xml:space="preserve"> </w:t>
-      </w:r>
-      <w:r>
-        <w:rPr>
-          <w:sz w:val="20"/>
-        </w:rPr>
-        <w:t xml:space="preserve">l’étudiant(e)) </w:t>
-      </w:r>
-      <w:r>
-        <w:t>:</w:t>
-      </w:r>
-      <w:r>
-        <w:rPr>
-          <w:spacing w:val="-8"/>
-        </w:rPr>
-        <w:t xml:space="preserve"> </w:t>
-      </w:r>
-      <w:r>
-        <w:t xml:space="preserve">{{NOM}} Filière</w:t>
-      </w:r>
-      <w:r>
-        <w:rPr>
-          <w:spacing w:val="-15"/>
-        </w:rPr>
-        <w:t xml:space="preserve"> </w:t>
-      </w:r>
-      <w:r>
-        <w:t>:</w:t>
-      </w:r>
-      <w:r>
-        <w:rPr>
-          <w:spacing w:val="-15"/>
-        </w:rPr>
-        <w:t xml:space="preserve"> </w:t>
-      </w:r>
-      <w:r>
-        <w:t xml:space="preserve">{{FILIERE}}   Entreprise d’accueil : {{ENTREPRISE}}   Date de soutenance : </w:t>
+        <w:spacing w:before="80"/>
+        <w:ind w:left="170"/>
+      </w:pPr>
+      <w:r>
+        <w:t xml:space="preserve">Matricule : {{MATRICULE}}</w:t>
+      </w:r>
+    </w:p>
+    <w:p>
+      <w:pPr>
+        <w:pStyle w:val="Corpsdetexte"/>
+        <w:spacing w:before="80"/>
+        <w:ind w:left="170"/>
+      </w:pPr>
+      <w:r>
+        <w:t xml:space="preserve">Nom &amp; Prénom (de l’étudiant(e)) : {{NOM}}</w:t>
+      </w:r>
+    </w:p>
+    <w:p>
+      <w:pPr>
+        <w:pStyle w:val="Corpsdetexte"/>
+        <w:spacing w:before="80"/>
+        <w:ind w:left="170"/>
+      </w:pPr>
+      <w:r>
+        <w:t xml:space="preserve">Filière : {{FILIERE}}</w:t>
+      </w:r>
+    </w:p>
+    <w:p>
+      <w:pPr>
+        <w:pStyle w:val="Corpsdetexte"/>
+        <w:spacing w:before="80"/>
+        <w:ind w:left="170"/>
+      </w:pPr>
+      <w:r>
+        <w:t xml:space="preserve">Organisme d’accueil : {{ENTREPRISE}}</w:t>
+      </w:r>
+    </w:p>
+    <w:p>
+      <w:pPr>
+        <w:pStyle w:val="Corpsdetexte"/>
+        <w:spacing w:before="80"/>
+        <w:ind w:left="170"/>
+      </w:pPr>
+      <w:r>
+        <w:t xml:space="preserve">Date de soutenance : </w:t>
       </w:r>
       <w:r>
         <w:rPr>
@@ -574,7 +522,7 @@
         <w:t>{{DJ}}</w:t>
       </w:r>
       <w:r>
-        <w:t xml:space="preserve">/ </w:t>
+        <w:t xml:space="preserve"> / </w:t>
       </w:r>
       <w:r>
         <w:rPr>
@@ -585,7 +533,7 @@
         <w:t>{{DM}}</w:t>
       </w:r>
       <w:r>
-        <w:t>/ 2026</w:t>
+        <w:t xml:space="preserve"> / 2026</w:t>
       </w:r>
     </w:p>
     <w:p>

</xml_diff>